<commit_message>
feat: update leave workflows and reporting
</commit_message>
<xml_diff>
--- a/public/assets/LEAVECARD.docx
+++ b/public/assets/LEAVECARD.docx
@@ -4,30 +4,237 @@
   <w:body>
     <w:p>
       <w:pPr>
-        <w:spacing w:before="100" w:beforeAutospacing="1" w:after="100" w:afterAutospacing="1"/>
+        <w:spacing w:before="0" w:after="0"/>
+        <w:jc w:val="center"/>
+        <w:rPr>
+          <w:rFonts w:ascii="Times New Roman" w:hAnsi="Times New Roman"/>
+        </w:rPr>
       </w:pPr>
+      <w:r>
+        <w:rPr>
+          <w:rFonts w:ascii="Times New Roman" w:hAnsi="Times New Roman"/>
+          <w:b/>
+          <w:bCs/>
+          <w:noProof/>
+          <w14:ligatures w14:val="standardContextual"/>
+        </w:rPr>
+        <w:drawing>
+          <wp:anchor distT="0" distB="0" distL="114300" distR="114300" simplePos="0" relativeHeight="251659264" behindDoc="0" locked="0" layoutInCell="1" allowOverlap="1" wp14:anchorId="44F832D9" wp14:editId="6825E7B4">
+            <wp:simplePos x="0" y="0"/>
+            <wp:positionH relativeFrom="page">
+              <wp:posOffset>5791200</wp:posOffset>
+            </wp:positionH>
+            <wp:positionV relativeFrom="page">
+              <wp:posOffset>742315</wp:posOffset>
+            </wp:positionV>
+            <wp:extent cx="923925" cy="923925"/>
+            <wp:effectExtent l="0" t="0" r="9525" b="9525"/>
+            <wp:wrapNone/>
+            <wp:docPr id="2106218425" name="Picture 1"/>
+            <wp:cNvGraphicFramePr>
+              <a:graphicFrameLocks xmlns:a="http://schemas.openxmlformats.org/drawingml/2006/main" noChangeAspect="1"/>
+            </wp:cNvGraphicFramePr>
+            <a:graphic xmlns:a="http://schemas.openxmlformats.org/drawingml/2006/main">
+              <a:graphicData uri="http://schemas.openxmlformats.org/drawingml/2006/picture">
+                <pic:pic xmlns:pic="http://schemas.openxmlformats.org/drawingml/2006/picture">
+                  <pic:nvPicPr>
+                    <pic:cNvPr id="2106218425" name="Picture 2106218425"/>
+                    <pic:cNvPicPr/>
+                  </pic:nvPicPr>
+                  <pic:blipFill>
+                    <a:blip r:embed="rId5" cstate="print">
+                      <a:extLst>
+                        <a:ext uri="{28A0092B-C50C-407E-A947-70E740481C1C}">
+                          <a14:useLocalDpi xmlns:a14="http://schemas.microsoft.com/office/drawing/2010/main" val="0"/>
+                        </a:ext>
+                      </a:extLst>
+                    </a:blip>
+                    <a:stretch>
+                      <a:fillRect/>
+                    </a:stretch>
+                  </pic:blipFill>
+                  <pic:spPr>
+                    <a:xfrm>
+                      <a:off x="0" y="0"/>
+                      <a:ext cx="923925" cy="923925"/>
+                    </a:xfrm>
+                    <a:prstGeom prst="rect">
+                      <a:avLst/>
+                    </a:prstGeom>
+                  </pic:spPr>
+                </pic:pic>
+              </a:graphicData>
+            </a:graphic>
+            <wp14:sizeRelH relativeFrom="margin">
+              <wp14:pctWidth>0</wp14:pctWidth>
+            </wp14:sizeRelH>
+            <wp14:sizeRelV relativeFrom="margin">
+              <wp14:pctHeight>0</wp14:pctHeight>
+            </wp14:sizeRelV>
+          </wp:anchor>
+        </w:drawing>
+      </w:r>
+      <w:r>
+        <w:rPr>
+          <w:rFonts w:ascii="Times New Roman" w:hAnsi="Times New Roman"/>
+          <w:b/>
+          <w:bCs/>
+          <w:noProof/>
+          <w14:ligatures w14:val="standardContextual"/>
+        </w:rPr>
+        <w:drawing>
+          <wp:anchor distT="0" distB="0" distL="114300" distR="114300" simplePos="0" relativeHeight="251660288" behindDoc="0" locked="0" layoutInCell="1" allowOverlap="1" wp14:anchorId="2BFFED5B" wp14:editId="30167226">
+            <wp:simplePos x="0" y="0"/>
+            <wp:positionH relativeFrom="page">
+              <wp:posOffset>1113790</wp:posOffset>
+            </wp:positionH>
+            <wp:positionV relativeFrom="page">
+              <wp:posOffset>742950</wp:posOffset>
+            </wp:positionV>
+            <wp:extent cx="942975" cy="942471"/>
+            <wp:effectExtent l="0" t="0" r="0" b="0"/>
+            <wp:wrapNone/>
+            <wp:docPr id="369911138" name="Picture 2"/>
+            <wp:cNvGraphicFramePr>
+              <a:graphicFrameLocks xmlns:a="http://schemas.openxmlformats.org/drawingml/2006/main" noChangeAspect="1"/>
+            </wp:cNvGraphicFramePr>
+            <a:graphic xmlns:a="http://schemas.openxmlformats.org/drawingml/2006/main">
+              <a:graphicData uri="http://schemas.openxmlformats.org/drawingml/2006/picture">
+                <pic:pic xmlns:pic="http://schemas.openxmlformats.org/drawingml/2006/picture">
+                  <pic:nvPicPr>
+                    <pic:cNvPr id="369911138" name="Picture 369911138"/>
+                    <pic:cNvPicPr/>
+                  </pic:nvPicPr>
+                  <pic:blipFill>
+                    <a:blip r:embed="rId6" cstate="print">
+                      <a:extLst>
+                        <a:ext uri="{28A0092B-C50C-407E-A947-70E740481C1C}">
+                          <a14:useLocalDpi xmlns:a14="http://schemas.microsoft.com/office/drawing/2010/main" val="0"/>
+                        </a:ext>
+                      </a:extLst>
+                    </a:blip>
+                    <a:stretch>
+                      <a:fillRect/>
+                    </a:stretch>
+                  </pic:blipFill>
+                  <pic:spPr>
+                    <a:xfrm>
+                      <a:off x="0" y="0"/>
+                      <a:ext cx="942975" cy="942471"/>
+                    </a:xfrm>
+                    <a:prstGeom prst="rect">
+                      <a:avLst/>
+                    </a:prstGeom>
+                  </pic:spPr>
+                </pic:pic>
+              </a:graphicData>
+            </a:graphic>
+            <wp14:sizeRelH relativeFrom="margin">
+              <wp14:pctWidth>0</wp14:pctWidth>
+            </wp14:sizeRelH>
+            <wp14:sizeRelV relativeFrom="margin">
+              <wp14:pctHeight>0</wp14:pctHeight>
+            </wp14:sizeRelV>
+          </wp:anchor>
+        </w:drawing>
+      </w:r>
+      <w:r>
+        <w:rPr>
+          <w:rFonts w:ascii="Times New Roman" w:hAnsi="Times New Roman"/>
+        </w:rPr>
+        <w:t xml:space="preserve">Republic of the Philippines </w:t>
+      </w:r>
+    </w:p>
+    <w:p>
+      <w:pPr>
+        <w:spacing w:before="0" w:after="0"/>
+        <w:jc w:val="center"/>
+        <w:rPr>
+          <w:rFonts w:ascii="Times New Roman" w:hAnsi="Times New Roman"/>
+          <w:b/>
+          <w:bCs/>
+        </w:rPr>
+      </w:pPr>
+      <w:r>
+        <w:rPr>
+          <w:rFonts w:ascii="Times New Roman" w:hAnsi="Times New Roman"/>
+          <w:b/>
+          <w:bCs/>
+        </w:rPr>
+        <w:t>DEPARTMENT OF EDUCATION</w:t>
+      </w:r>
+    </w:p>
+    <w:p>
+      <w:pPr>
+        <w:spacing w:before="0" w:after="0"/>
+        <w:jc w:val="center"/>
+        <w:rPr>
+          <w:rFonts w:ascii="Times New Roman" w:hAnsi="Times New Roman"/>
+          <w:b/>
+          <w:bCs/>
+        </w:rPr>
+      </w:pPr>
+      <w:r>
+        <w:rPr>
+          <w:rFonts w:ascii="Times New Roman" w:hAnsi="Times New Roman"/>
+          <w:b/>
+          <w:bCs/>
+        </w:rPr>
+        <w:t xml:space="preserve"> Region IV A – CALABARZON</w:t>
+      </w:r>
+    </w:p>
+    <w:p>
+      <w:pPr>
+        <w:spacing w:before="0" w:after="0"/>
+        <w:jc w:val="center"/>
+        <w:rPr>
+          <w:rFonts w:ascii="Times New Roman" w:hAnsi="Times New Roman"/>
+          <w:b/>
+          <w:bCs/>
+        </w:rPr>
+      </w:pPr>
+      <w:r>
+        <w:rPr>
+          <w:rFonts w:ascii="Times New Roman" w:hAnsi="Times New Roman"/>
+        </w:rPr>
+        <w:t xml:space="preserve"> </w:t>
+      </w:r>
+      <w:r>
+        <w:rPr>
+          <w:rFonts w:ascii="Times New Roman" w:hAnsi="Times New Roman"/>
+          <w:b/>
+          <w:bCs/>
+        </w:rPr>
+        <w:t xml:space="preserve">SCHOOLS DIVISION OFFICE OF SAN PEDRO CITY </w:t>
+      </w:r>
+      <w:r>
+        <w:rPr>
+          <w:b/>
+          <w:bCs/>
+        </w:rPr>
+        <w:br/>
+      </w:r>
     </w:p>
     <w:tbl>
       <w:tblPr>
         <w:tblStyle w:val="TableGrid"/>
         <w:tblpPr w:leftFromText="180" w:rightFromText="180" w:vertAnchor="text" w:horzAnchor="margin" w:tblpXSpec="center" w:tblpY="76"/>
-        <w:tblW w:w="10660" w:type="dxa"/>
+        <w:tblW w:w="11160" w:type="dxa"/>
         <w:tblLayout w:type="fixed"/>
         <w:tblLook w:val="04A0" w:firstRow="1" w:lastRow="0" w:firstColumn="1" w:lastColumn="0" w:noHBand="0" w:noVBand="1"/>
       </w:tblPr>
       <w:tblGrid>
-        <w:gridCol w:w="1080"/>
-        <w:gridCol w:w="1800"/>
+        <w:gridCol w:w="1440"/>
+        <w:gridCol w:w="1440"/>
         <w:gridCol w:w="810"/>
-        <w:gridCol w:w="810"/>
-        <w:gridCol w:w="810"/>
-        <w:gridCol w:w="810"/>
-        <w:gridCol w:w="810"/>
-        <w:gridCol w:w="810"/>
+        <w:gridCol w:w="900"/>
+        <w:gridCol w:w="720"/>
+        <w:gridCol w:w="900"/>
+        <w:gridCol w:w="720"/>
         <w:gridCol w:w="810"/>
         <w:gridCol w:w="720"/>
-        <w:gridCol w:w="1365"/>
-        <w:gridCol w:w="25"/>
+        <w:gridCol w:w="900"/>
+        <w:gridCol w:w="1800"/>
       </w:tblGrid>
       <w:tr>
         <w:trPr>
@@ -35,7 +242,7 @@
         </w:trPr>
         <w:tc>
           <w:tcPr>
-            <w:tcW w:w="6120" w:type="dxa"/>
+            <w:tcW w:w="6210" w:type="dxa"/>
             <w:gridSpan w:val="6"/>
             <w:tcBorders>
               <w:top w:val="nil"/>
@@ -67,7 +274,7 @@
               </w:rPr>
             </w:pPr>
             <w:r>
-              <w:t xml:space="preserve">           </w:t>
+              <w:t xml:space="preserve">Name:    </w:t>
             </w:r>
             <w:r>
               <w:rPr>
@@ -84,7 +291,7 @@
                 <w:color w:val="000000"/>
                 <w:sz w:val="20"/>
               </w:rPr>
-              <w:t xml:space="preserve">FIRSTNAME}   </w:t>
+              <w:t>FIRSTNAME}  $</w:t>
             </w:r>
             <w:proofErr w:type="gramEnd"/>
             <w:r>
@@ -93,52 +300,14 @@
                 <w:color w:val="000000"/>
                 <w:sz w:val="20"/>
               </w:rPr>
-              <w:t>${MIDNAME}.</w:t>
-            </w:r>
-          </w:p>
-        </w:tc>
-        <w:tc>
-          <w:tcPr>
-            <w:tcW w:w="810" w:type="dxa"/>
-            <w:tcBorders>
-              <w:top w:val="nil"/>
-              <w:left w:val="nil"/>
-              <w:bottom w:val="nil"/>
-              <w:right w:val="nil"/>
-            </w:tcBorders>
-          </w:tcPr>
-          <w:p>
-            <w:pPr>
-              <w:tabs>
-                <w:tab w:val="left" w:pos="1084"/>
-              </w:tabs>
-              <w:spacing w:before="100" w:beforeAutospacing="1" w:after="100" w:afterAutospacing="1"/>
-            </w:pPr>
-          </w:p>
-        </w:tc>
-        <w:tc>
-          <w:tcPr>
-            <w:tcW w:w="810" w:type="dxa"/>
-            <w:tcBorders>
-              <w:top w:val="nil"/>
-              <w:left w:val="nil"/>
-              <w:bottom w:val="nil"/>
-              <w:right w:val="nil"/>
-            </w:tcBorders>
-          </w:tcPr>
-          <w:p>
-            <w:pPr>
-              <w:tabs>
-                <w:tab w:val="left" w:pos="1084"/>
-              </w:tabs>
-              <w:spacing w:before="100" w:beforeAutospacing="1" w:after="100" w:afterAutospacing="1"/>
-            </w:pPr>
-          </w:p>
-        </w:tc>
-        <w:tc>
-          <w:tcPr>
-            <w:tcW w:w="2920" w:type="dxa"/>
-            <w:gridSpan w:val="4"/>
+              <w:t>{MIDNAME}.</w:t>
+            </w:r>
+          </w:p>
+        </w:tc>
+        <w:tc>
+          <w:tcPr>
+            <w:tcW w:w="4950" w:type="dxa"/>
+            <w:gridSpan w:val="5"/>
             <w:tcBorders>
               <w:top w:val="nil"/>
               <w:left w:val="nil"/>
@@ -169,7 +338,7 @@
               </w:rPr>
             </w:pPr>
             <w:r>
-              <w:t xml:space="preserve">             </w:t>
+              <w:t xml:space="preserve">Date of Original Appointment:      </w:t>
             </w:r>
             <w:r>
               <w:rPr>
@@ -184,13 +353,11 @@
       </w:tr>
       <w:tr>
         <w:trPr>
-          <w:gridAfter w:val="1"/>
-          <w:wAfter w:w="25" w:type="dxa"/>
           <w:trHeight w:val="434"/>
         </w:trPr>
         <w:tc>
           <w:tcPr>
-            <w:tcW w:w="4500" w:type="dxa"/>
+            <w:tcW w:w="4590" w:type="dxa"/>
             <w:gridSpan w:val="4"/>
             <w:tcBorders>
               <w:top w:val="nil"/>
@@ -208,13 +375,13 @@
               <w:spacing w:before="100" w:beforeAutospacing="1" w:after="100" w:afterAutospacing="1"/>
             </w:pPr>
             <w:r>
-              <w:t xml:space="preserve">           ${DISTRICT}</w:t>
-            </w:r>
-          </w:p>
-        </w:tc>
-        <w:tc>
-          <w:tcPr>
-            <w:tcW w:w="810" w:type="dxa"/>
+              <w:t>District:  ${DISTRICT}</w:t>
+            </w:r>
+          </w:p>
+        </w:tc>
+        <w:tc>
+          <w:tcPr>
+            <w:tcW w:w="720" w:type="dxa"/>
             <w:tcBorders>
               <w:top w:val="nil"/>
               <w:left w:val="nil"/>
@@ -233,7 +400,7 @@
         </w:tc>
         <w:tc>
           <w:tcPr>
-            <w:tcW w:w="810" w:type="dxa"/>
+            <w:tcW w:w="900" w:type="dxa"/>
             <w:tcBorders>
               <w:top w:val="nil"/>
               <w:left w:val="nil"/>
@@ -252,46 +419,8 @@
         </w:tc>
         <w:tc>
           <w:tcPr>
-            <w:tcW w:w="810" w:type="dxa"/>
-            <w:tcBorders>
-              <w:top w:val="nil"/>
-              <w:left w:val="nil"/>
-              <w:bottom w:val="nil"/>
-              <w:right w:val="nil"/>
-            </w:tcBorders>
-          </w:tcPr>
-          <w:p>
-            <w:pPr>
-              <w:tabs>
-                <w:tab w:val="left" w:pos="1084"/>
-              </w:tabs>
-              <w:spacing w:before="100" w:beforeAutospacing="1" w:after="100" w:afterAutospacing="1"/>
-            </w:pPr>
-          </w:p>
-        </w:tc>
-        <w:tc>
-          <w:tcPr>
-            <w:tcW w:w="810" w:type="dxa"/>
-            <w:tcBorders>
-              <w:top w:val="nil"/>
-              <w:left w:val="nil"/>
-              <w:bottom w:val="nil"/>
-              <w:right w:val="nil"/>
-            </w:tcBorders>
-          </w:tcPr>
-          <w:p>
-            <w:pPr>
-              <w:tabs>
-                <w:tab w:val="left" w:pos="1084"/>
-              </w:tabs>
-              <w:spacing w:before="100" w:beforeAutospacing="1" w:after="100" w:afterAutospacing="1"/>
-            </w:pPr>
-          </w:p>
-        </w:tc>
-        <w:tc>
-          <w:tcPr>
-            <w:tcW w:w="2895" w:type="dxa"/>
-            <w:gridSpan w:val="3"/>
+            <w:tcW w:w="4950" w:type="dxa"/>
+            <w:gridSpan w:val="5"/>
             <w:tcBorders>
               <w:top w:val="nil"/>
               <w:left w:val="nil"/>
@@ -307,6 +436,7 @@
               <w:autoSpaceDN w:val="0"/>
               <w:adjustRightInd w:val="0"/>
               <w:spacing w:before="0" w:after="0" w:line="211" w:lineRule="exact"/>
+              <w:jc w:val="left"/>
               <w:rPr>
                 <w:rFonts w:cs="Calibri"/>
                 <w:color w:val="000000"/>
@@ -319,25 +449,22 @@
                 <w:color w:val="000000"/>
                 <w:sz w:val="20"/>
               </w:rPr>
-              <w:t xml:space="preserve">              ${STATUS}</w:t>
+              <w:t>Status:   ${STATUS}</w:t>
             </w:r>
           </w:p>
         </w:tc>
       </w:tr>
       <w:tr>
         <w:trPr>
-          <w:gridAfter w:val="1"/>
-          <w:wAfter w:w="25" w:type="dxa"/>
-          <w:trHeight w:val="1101"/>
+          <w:trHeight w:val="117"/>
         </w:trPr>
         <w:tc>
           <w:tcPr>
-            <w:tcW w:w="2880" w:type="dxa"/>
-            <w:gridSpan w:val="2"/>
+            <w:tcW w:w="1440" w:type="dxa"/>
             <w:tcBorders>
               <w:top w:val="nil"/>
               <w:left w:val="nil"/>
-              <w:bottom w:val="nil"/>
+              <w:bottom w:val="single" w:sz="4" w:space="0" w:color="auto"/>
               <w:right w:val="nil"/>
             </w:tcBorders>
           </w:tcPr>
@@ -355,11 +482,11 @@
         </w:tc>
         <w:tc>
           <w:tcPr>
-            <w:tcW w:w="810" w:type="dxa"/>
+            <w:tcW w:w="1440" w:type="dxa"/>
             <w:tcBorders>
               <w:top w:val="nil"/>
               <w:left w:val="nil"/>
-              <w:bottom w:val="nil"/>
+              <w:bottom w:val="single" w:sz="4" w:space="0" w:color="auto"/>
               <w:right w:val="nil"/>
             </w:tcBorders>
           </w:tcPr>
@@ -378,7 +505,7 @@
             <w:tcBorders>
               <w:top w:val="nil"/>
               <w:left w:val="nil"/>
-              <w:bottom w:val="nil"/>
+              <w:bottom w:val="single" w:sz="4" w:space="0" w:color="auto"/>
               <w:right w:val="nil"/>
             </w:tcBorders>
           </w:tcPr>
@@ -393,11 +520,11 @@
         </w:tc>
         <w:tc>
           <w:tcPr>
-            <w:tcW w:w="810" w:type="dxa"/>
+            <w:tcW w:w="900" w:type="dxa"/>
             <w:tcBorders>
               <w:top w:val="nil"/>
               <w:left w:val="nil"/>
-              <w:bottom w:val="nil"/>
+              <w:bottom w:val="single" w:sz="4" w:space="0" w:color="auto"/>
               <w:right w:val="nil"/>
             </w:tcBorders>
           </w:tcPr>
@@ -412,11 +539,11 @@
         </w:tc>
         <w:tc>
           <w:tcPr>
-            <w:tcW w:w="810" w:type="dxa"/>
+            <w:tcW w:w="720" w:type="dxa"/>
             <w:tcBorders>
               <w:top w:val="nil"/>
               <w:left w:val="nil"/>
-              <w:bottom w:val="nil"/>
+              <w:bottom w:val="single" w:sz="4" w:space="0" w:color="auto"/>
               <w:right w:val="nil"/>
             </w:tcBorders>
           </w:tcPr>
@@ -431,11 +558,11 @@
         </w:tc>
         <w:tc>
           <w:tcPr>
-            <w:tcW w:w="810" w:type="dxa"/>
+            <w:tcW w:w="900" w:type="dxa"/>
             <w:tcBorders>
               <w:top w:val="nil"/>
               <w:left w:val="nil"/>
-              <w:bottom w:val="nil"/>
+              <w:bottom w:val="single" w:sz="4" w:space="0" w:color="auto"/>
               <w:right w:val="nil"/>
             </w:tcBorders>
           </w:tcPr>
@@ -450,11 +577,11 @@
         </w:tc>
         <w:tc>
           <w:tcPr>
-            <w:tcW w:w="810" w:type="dxa"/>
+            <w:tcW w:w="720" w:type="dxa"/>
             <w:tcBorders>
               <w:top w:val="nil"/>
               <w:left w:val="nil"/>
-              <w:bottom w:val="nil"/>
+              <w:bottom w:val="single" w:sz="4" w:space="0" w:color="auto"/>
               <w:right w:val="nil"/>
             </w:tcBorders>
           </w:tcPr>
@@ -473,7 +600,7 @@
             <w:tcBorders>
               <w:top w:val="nil"/>
               <w:left w:val="nil"/>
-              <w:bottom w:val="nil"/>
+              <w:bottom w:val="single" w:sz="4" w:space="0" w:color="auto"/>
               <w:right w:val="nil"/>
             </w:tcBorders>
           </w:tcPr>
@@ -492,7 +619,7 @@
             <w:tcBorders>
               <w:top w:val="nil"/>
               <w:left w:val="nil"/>
-              <w:bottom w:val="nil"/>
+              <w:bottom w:val="single" w:sz="4" w:space="0" w:color="auto"/>
               <w:right w:val="nil"/>
             </w:tcBorders>
           </w:tcPr>
@@ -507,11 +634,30 @@
         </w:tc>
         <w:tc>
           <w:tcPr>
-            <w:tcW w:w="1365" w:type="dxa"/>
+            <w:tcW w:w="900" w:type="dxa"/>
             <w:tcBorders>
               <w:top w:val="nil"/>
               <w:left w:val="nil"/>
-              <w:bottom w:val="nil"/>
+              <w:bottom w:val="single" w:sz="4" w:space="0" w:color="auto"/>
+              <w:right w:val="nil"/>
+            </w:tcBorders>
+          </w:tcPr>
+          <w:p>
+            <w:pPr>
+              <w:tabs>
+                <w:tab w:val="left" w:pos="1084"/>
+              </w:tabs>
+              <w:spacing w:before="100" w:beforeAutospacing="1" w:after="100" w:afterAutospacing="1"/>
+            </w:pPr>
+          </w:p>
+        </w:tc>
+        <w:tc>
+          <w:tcPr>
+            <w:tcW w:w="1800" w:type="dxa"/>
+            <w:tcBorders>
+              <w:top w:val="nil"/>
+              <w:left w:val="nil"/>
+              <w:bottom w:val="single" w:sz="4" w:space="0" w:color="auto"/>
               <w:right w:val="nil"/>
             </w:tcBorders>
           </w:tcPr>
@@ -527,234 +673,637 @@
       </w:tr>
       <w:tr>
         <w:trPr>
-          <w:gridAfter w:val="1"/>
-          <w:wAfter w:w="25" w:type="dxa"/>
-          <w:trHeight w:val="480"/>
+          <w:trHeight w:val="477"/>
         </w:trPr>
         <w:tc>
           <w:tcPr>
-            <w:tcW w:w="1080" w:type="dxa"/>
-            <w:tcBorders>
-              <w:top w:val="nil"/>
-              <w:left w:val="nil"/>
-              <w:bottom w:val="nil"/>
-              <w:right w:val="nil"/>
-            </w:tcBorders>
-          </w:tcPr>
-          <w:p>
-            <w:pPr>
-              <w:tabs>
-                <w:tab w:val="left" w:pos="1084"/>
-              </w:tabs>
-              <w:spacing w:before="0"/>
-            </w:pPr>
-          </w:p>
-        </w:tc>
-        <w:tc>
-          <w:tcPr>
-            <w:tcW w:w="1800" w:type="dxa"/>
-            <w:tcBorders>
-              <w:top w:val="nil"/>
-              <w:left w:val="nil"/>
-              <w:bottom w:val="nil"/>
-              <w:right w:val="nil"/>
-            </w:tcBorders>
-          </w:tcPr>
-          <w:p>
-            <w:pPr>
-              <w:tabs>
-                <w:tab w:val="left" w:pos="1084"/>
-              </w:tabs>
-              <w:spacing w:before="0"/>
-            </w:pPr>
-          </w:p>
-        </w:tc>
-        <w:tc>
-          <w:tcPr>
-            <w:tcW w:w="810" w:type="dxa"/>
-            <w:tcBorders>
-              <w:top w:val="nil"/>
-              <w:left w:val="nil"/>
-              <w:bottom w:val="nil"/>
-              <w:right w:val="nil"/>
-            </w:tcBorders>
-          </w:tcPr>
-          <w:p>
-            <w:pPr>
-              <w:tabs>
-                <w:tab w:val="left" w:pos="1084"/>
-              </w:tabs>
-              <w:spacing w:before="0"/>
-            </w:pPr>
-          </w:p>
-        </w:tc>
-        <w:tc>
-          <w:tcPr>
-            <w:tcW w:w="810" w:type="dxa"/>
-            <w:tcBorders>
-              <w:top w:val="nil"/>
-              <w:left w:val="nil"/>
-              <w:bottom w:val="nil"/>
-              <w:right w:val="nil"/>
-            </w:tcBorders>
-          </w:tcPr>
-          <w:p>
-            <w:pPr>
-              <w:tabs>
-                <w:tab w:val="left" w:pos="1084"/>
-              </w:tabs>
-              <w:spacing w:before="0"/>
-            </w:pPr>
-          </w:p>
-        </w:tc>
-        <w:tc>
-          <w:tcPr>
-            <w:tcW w:w="810" w:type="dxa"/>
-            <w:tcBorders>
-              <w:top w:val="nil"/>
-              <w:left w:val="nil"/>
-              <w:bottom w:val="nil"/>
-              <w:right w:val="nil"/>
-            </w:tcBorders>
-          </w:tcPr>
-          <w:p>
-            <w:pPr>
-              <w:tabs>
-                <w:tab w:val="left" w:pos="1084"/>
-              </w:tabs>
-              <w:spacing w:before="0"/>
-            </w:pPr>
-          </w:p>
-        </w:tc>
-        <w:tc>
-          <w:tcPr>
-            <w:tcW w:w="810" w:type="dxa"/>
-            <w:tcBorders>
-              <w:top w:val="nil"/>
-              <w:left w:val="nil"/>
-              <w:bottom w:val="nil"/>
-              <w:right w:val="nil"/>
-            </w:tcBorders>
-          </w:tcPr>
-          <w:p>
-            <w:pPr>
-              <w:tabs>
-                <w:tab w:val="left" w:pos="1084"/>
-              </w:tabs>
-              <w:spacing w:before="0"/>
-            </w:pPr>
-          </w:p>
-        </w:tc>
-        <w:tc>
-          <w:tcPr>
-            <w:tcW w:w="810" w:type="dxa"/>
-            <w:tcBorders>
-              <w:top w:val="nil"/>
-              <w:left w:val="nil"/>
-              <w:bottom w:val="nil"/>
-              <w:right w:val="nil"/>
-            </w:tcBorders>
-          </w:tcPr>
-          <w:p>
-            <w:pPr>
-              <w:tabs>
-                <w:tab w:val="left" w:pos="1084"/>
-              </w:tabs>
-              <w:spacing w:before="0"/>
-            </w:pPr>
-          </w:p>
-        </w:tc>
-        <w:tc>
-          <w:tcPr>
-            <w:tcW w:w="810" w:type="dxa"/>
-            <w:tcBorders>
-              <w:top w:val="nil"/>
-              <w:left w:val="nil"/>
-              <w:bottom w:val="nil"/>
-              <w:right w:val="nil"/>
-            </w:tcBorders>
-          </w:tcPr>
-          <w:p>
-            <w:pPr>
-              <w:tabs>
-                <w:tab w:val="left" w:pos="1084"/>
-              </w:tabs>
-              <w:spacing w:before="0"/>
-            </w:pPr>
-          </w:p>
-        </w:tc>
-        <w:tc>
-          <w:tcPr>
-            <w:tcW w:w="810" w:type="dxa"/>
-            <w:tcBorders>
-              <w:top w:val="nil"/>
-              <w:left w:val="nil"/>
-              <w:bottom w:val="nil"/>
-              <w:right w:val="nil"/>
-            </w:tcBorders>
-          </w:tcPr>
-          <w:p>
-            <w:pPr>
-              <w:tabs>
-                <w:tab w:val="left" w:pos="1084"/>
-              </w:tabs>
-              <w:spacing w:before="0"/>
-            </w:pPr>
-          </w:p>
-        </w:tc>
-        <w:tc>
-          <w:tcPr>
-            <w:tcW w:w="720" w:type="dxa"/>
-            <w:tcBorders>
-              <w:top w:val="nil"/>
-              <w:left w:val="nil"/>
-              <w:bottom w:val="nil"/>
-              <w:right w:val="nil"/>
-            </w:tcBorders>
-          </w:tcPr>
-          <w:p>
-            <w:pPr>
-              <w:tabs>
-                <w:tab w:val="left" w:pos="1084"/>
-              </w:tabs>
-              <w:spacing w:before="0"/>
-            </w:pPr>
-          </w:p>
-        </w:tc>
-        <w:tc>
-          <w:tcPr>
-            <w:tcW w:w="1365" w:type="dxa"/>
-            <w:tcBorders>
-              <w:top w:val="nil"/>
-              <w:left w:val="nil"/>
-              <w:bottom w:val="nil"/>
-              <w:right w:val="nil"/>
-            </w:tcBorders>
-          </w:tcPr>
-          <w:p>
-            <w:pPr>
-              <w:tabs>
-                <w:tab w:val="left" w:pos="1084"/>
-              </w:tabs>
-              <w:spacing w:before="0"/>
-            </w:pPr>
+            <w:tcW w:w="6930" w:type="dxa"/>
+            <w:gridSpan w:val="7"/>
+            <w:tcBorders>
+              <w:top w:val="single" w:sz="4" w:space="0" w:color="auto"/>
+              <w:left w:val="single" w:sz="4" w:space="0" w:color="auto"/>
+              <w:bottom w:val="single" w:sz="4" w:space="0" w:color="auto"/>
+              <w:right w:val="single" w:sz="4" w:space="0" w:color="auto"/>
+            </w:tcBorders>
+            <w:vAlign w:val="center"/>
+          </w:tcPr>
+          <w:p>
+            <w:pPr>
+              <w:tabs>
+                <w:tab w:val="left" w:pos="1084"/>
+              </w:tabs>
+              <w:spacing w:before="100" w:beforeAutospacing="1" w:after="100" w:afterAutospacing="1"/>
+              <w:jc w:val="center"/>
+            </w:pPr>
+            <w:r>
+              <w:t>DIVISION / OFFICE</w:t>
+            </w:r>
+          </w:p>
+        </w:tc>
+        <w:tc>
+          <w:tcPr>
+            <w:tcW w:w="4230" w:type="dxa"/>
+            <w:gridSpan w:val="4"/>
+            <w:tcBorders>
+              <w:top w:val="single" w:sz="4" w:space="0" w:color="auto"/>
+              <w:left w:val="single" w:sz="4" w:space="0" w:color="auto"/>
+              <w:bottom w:val="single" w:sz="4" w:space="0" w:color="auto"/>
+              <w:right w:val="single" w:sz="4" w:space="0" w:color="auto"/>
+            </w:tcBorders>
+            <w:vAlign w:val="center"/>
+          </w:tcPr>
+          <w:p>
+            <w:pPr>
+              <w:tabs>
+                <w:tab w:val="left" w:pos="1084"/>
+              </w:tabs>
+              <w:spacing w:before="100" w:beforeAutospacing="1" w:after="100" w:afterAutospacing="1"/>
+              <w:jc w:val="center"/>
+            </w:pPr>
+            <w:r>
+              <w:t>1</w:t>
+            </w:r>
+            <w:r>
+              <w:rPr>
+                <w:vertAlign w:val="superscript"/>
+              </w:rPr>
+              <w:t>st</w:t>
+            </w:r>
+            <w:r>
+              <w:t xml:space="preserve"> DAY OF SERVICE</w:t>
+            </w:r>
           </w:p>
         </w:tc>
       </w:tr>
       <w:tr>
         <w:trPr>
-          <w:gridAfter w:val="1"/>
-          <w:wAfter w:w="25" w:type="dxa"/>
+          <w:trHeight w:val="360"/>
+        </w:trPr>
+        <w:tc>
+          <w:tcPr>
+            <w:tcW w:w="1440" w:type="dxa"/>
+            <w:vMerge w:val="restart"/>
+            <w:tcBorders>
+              <w:top w:val="single" w:sz="4" w:space="0" w:color="auto"/>
+              <w:left w:val="single" w:sz="4" w:space="0" w:color="auto"/>
+              <w:bottom w:val="single" w:sz="4" w:space="0" w:color="auto"/>
+              <w:right w:val="single" w:sz="4" w:space="0" w:color="auto"/>
+            </w:tcBorders>
+            <w:vAlign w:val="center"/>
+          </w:tcPr>
+          <w:p>
+            <w:pPr>
+              <w:tabs>
+                <w:tab w:val="left" w:pos="1084"/>
+              </w:tabs>
+              <w:spacing w:before="100" w:beforeAutospacing="1" w:after="100" w:afterAutospacing="1"/>
+              <w:jc w:val="center"/>
+            </w:pPr>
+            <w:r>
+              <w:t>PERIOD</w:t>
+            </w:r>
+          </w:p>
+        </w:tc>
+        <w:tc>
+          <w:tcPr>
+            <w:tcW w:w="1440" w:type="dxa"/>
+            <w:vMerge w:val="restart"/>
+            <w:tcBorders>
+              <w:top w:val="single" w:sz="4" w:space="0" w:color="auto"/>
+              <w:left w:val="single" w:sz="4" w:space="0" w:color="auto"/>
+              <w:bottom w:val="single" w:sz="4" w:space="0" w:color="auto"/>
+              <w:right w:val="single" w:sz="4" w:space="0" w:color="auto"/>
+            </w:tcBorders>
+            <w:vAlign w:val="center"/>
+          </w:tcPr>
+          <w:p>
+            <w:pPr>
+              <w:tabs>
+                <w:tab w:val="left" w:pos="1084"/>
+              </w:tabs>
+              <w:spacing w:before="100" w:beforeAutospacing="1" w:after="100" w:afterAutospacing="1"/>
+              <w:jc w:val="center"/>
+            </w:pPr>
+            <w:r>
+              <w:t>PARTICULARS</w:t>
+            </w:r>
+          </w:p>
+        </w:tc>
+        <w:tc>
+          <w:tcPr>
+            <w:tcW w:w="3330" w:type="dxa"/>
+            <w:gridSpan w:val="4"/>
+            <w:tcBorders>
+              <w:top w:val="single" w:sz="4" w:space="0" w:color="auto"/>
+              <w:left w:val="single" w:sz="4" w:space="0" w:color="auto"/>
+              <w:bottom w:val="single" w:sz="4" w:space="0" w:color="auto"/>
+              <w:right w:val="single" w:sz="4" w:space="0" w:color="auto"/>
+            </w:tcBorders>
+            <w:vAlign w:val="center"/>
+          </w:tcPr>
+          <w:p>
+            <w:pPr>
+              <w:tabs>
+                <w:tab w:val="left" w:pos="1084"/>
+              </w:tabs>
+              <w:spacing w:before="100" w:beforeAutospacing="1" w:after="100" w:afterAutospacing="1"/>
+              <w:jc w:val="center"/>
+            </w:pPr>
+            <w:r>
+              <w:t>VACATION LEAVE</w:t>
+            </w:r>
+          </w:p>
+        </w:tc>
+        <w:tc>
+          <w:tcPr>
+            <w:tcW w:w="3150" w:type="dxa"/>
+            <w:gridSpan w:val="4"/>
+            <w:tcBorders>
+              <w:top w:val="single" w:sz="4" w:space="0" w:color="auto"/>
+              <w:left w:val="single" w:sz="4" w:space="0" w:color="auto"/>
+              <w:bottom w:val="single" w:sz="4" w:space="0" w:color="auto"/>
+              <w:right w:val="single" w:sz="4" w:space="0" w:color="auto"/>
+            </w:tcBorders>
+            <w:vAlign w:val="center"/>
+          </w:tcPr>
+          <w:p>
+            <w:pPr>
+              <w:tabs>
+                <w:tab w:val="left" w:pos="1084"/>
+              </w:tabs>
+              <w:spacing w:before="100" w:beforeAutospacing="1" w:after="100" w:afterAutospacing="1"/>
+              <w:jc w:val="center"/>
+            </w:pPr>
+            <w:r>
+              <w:t>SICK LEAVE</w:t>
+            </w:r>
+          </w:p>
+        </w:tc>
+        <w:tc>
+          <w:tcPr>
+            <w:tcW w:w="1800" w:type="dxa"/>
+            <w:vMerge w:val="restart"/>
+            <w:tcBorders>
+              <w:top w:val="single" w:sz="4" w:space="0" w:color="auto"/>
+              <w:left w:val="single" w:sz="4" w:space="0" w:color="auto"/>
+              <w:bottom w:val="single" w:sz="4" w:space="0" w:color="auto"/>
+              <w:right w:val="single" w:sz="4" w:space="0" w:color="auto"/>
+            </w:tcBorders>
+            <w:vAlign w:val="center"/>
+          </w:tcPr>
+          <w:p>
+            <w:pPr>
+              <w:tabs>
+                <w:tab w:val="left" w:pos="1084"/>
+              </w:tabs>
+              <w:spacing w:before="100" w:beforeAutospacing="1" w:after="100" w:afterAutospacing="1"/>
+              <w:jc w:val="center"/>
+              <w:rPr>
+                <w:sz w:val="14"/>
+                <w:szCs w:val="14"/>
+              </w:rPr>
+            </w:pPr>
+            <w:r>
+              <w:rPr>
+                <w:sz w:val="14"/>
+                <w:szCs w:val="14"/>
+              </w:rPr>
+              <w:t>DATE AND ACTION TAKEN ON APPLCIATION FOR LEAVE</w:t>
+            </w:r>
+          </w:p>
+        </w:tc>
+      </w:tr>
+      <w:tr>
+        <w:trPr>
+          <w:trHeight w:val="350"/>
+        </w:trPr>
+        <w:tc>
+          <w:tcPr>
+            <w:tcW w:w="1440" w:type="dxa"/>
+            <w:vMerge/>
+            <w:tcBorders>
+              <w:top w:val="single" w:sz="4" w:space="0" w:color="auto"/>
+              <w:left w:val="single" w:sz="4" w:space="0" w:color="auto"/>
+              <w:bottom w:val="single" w:sz="4" w:space="0" w:color="auto"/>
+              <w:right w:val="single" w:sz="4" w:space="0" w:color="auto"/>
+            </w:tcBorders>
+          </w:tcPr>
+          <w:p>
+            <w:pPr>
+              <w:tabs>
+                <w:tab w:val="left" w:pos="1084"/>
+              </w:tabs>
+              <w:spacing w:before="0"/>
+            </w:pPr>
+          </w:p>
+        </w:tc>
+        <w:tc>
+          <w:tcPr>
+            <w:tcW w:w="1440" w:type="dxa"/>
+            <w:vMerge/>
+            <w:tcBorders>
+              <w:top w:val="single" w:sz="4" w:space="0" w:color="auto"/>
+              <w:left w:val="single" w:sz="4" w:space="0" w:color="auto"/>
+              <w:bottom w:val="single" w:sz="4" w:space="0" w:color="auto"/>
+              <w:right w:val="single" w:sz="4" w:space="0" w:color="auto"/>
+            </w:tcBorders>
+          </w:tcPr>
+          <w:p>
+            <w:pPr>
+              <w:tabs>
+                <w:tab w:val="left" w:pos="1084"/>
+              </w:tabs>
+              <w:spacing w:before="0"/>
+            </w:pPr>
+          </w:p>
+        </w:tc>
+        <w:tc>
+          <w:tcPr>
+            <w:tcW w:w="810" w:type="dxa"/>
+            <w:tcBorders>
+              <w:top w:val="single" w:sz="4" w:space="0" w:color="auto"/>
+              <w:left w:val="single" w:sz="4" w:space="0" w:color="auto"/>
+              <w:bottom w:val="single" w:sz="4" w:space="0" w:color="auto"/>
+              <w:right w:val="single" w:sz="4" w:space="0" w:color="auto"/>
+            </w:tcBorders>
+            <w:vAlign w:val="center"/>
+          </w:tcPr>
+          <w:p>
+            <w:pPr>
+              <w:tabs>
+                <w:tab w:val="left" w:pos="1084"/>
+              </w:tabs>
+              <w:spacing w:before="0"/>
+              <w:jc w:val="center"/>
+              <w:rPr>
+                <w:sz w:val="12"/>
+                <w:szCs w:val="12"/>
+              </w:rPr>
+            </w:pPr>
+            <w:r>
+              <w:rPr>
+                <w:sz w:val="12"/>
+                <w:szCs w:val="12"/>
+              </w:rPr>
+              <w:t>EARNED</w:t>
+            </w:r>
+          </w:p>
+        </w:tc>
+        <w:tc>
+          <w:tcPr>
+            <w:tcW w:w="900" w:type="dxa"/>
+            <w:tcBorders>
+              <w:top w:val="single" w:sz="4" w:space="0" w:color="auto"/>
+              <w:left w:val="single" w:sz="4" w:space="0" w:color="auto"/>
+              <w:bottom w:val="single" w:sz="4" w:space="0" w:color="auto"/>
+              <w:right w:val="single" w:sz="4" w:space="0" w:color="auto"/>
+            </w:tcBorders>
+            <w:vAlign w:val="center"/>
+          </w:tcPr>
+          <w:p>
+            <w:pPr>
+              <w:tabs>
+                <w:tab w:val="left" w:pos="1084"/>
+              </w:tabs>
+              <w:spacing w:before="0"/>
+              <w:jc w:val="center"/>
+              <w:rPr>
+                <w:sz w:val="12"/>
+                <w:szCs w:val="12"/>
+              </w:rPr>
+            </w:pPr>
+            <w:r>
+              <w:rPr>
+                <w:sz w:val="12"/>
+                <w:szCs w:val="12"/>
+              </w:rPr>
+              <w:t>ABS</w:t>
+            </w:r>
+            <w:r>
+              <w:rPr>
+                <w:sz w:val="12"/>
+                <w:szCs w:val="12"/>
+              </w:rPr>
+              <w:t xml:space="preserve"> </w:t>
+            </w:r>
+            <w:r>
+              <w:rPr>
+                <w:sz w:val="12"/>
+                <w:szCs w:val="12"/>
+              </w:rPr>
+              <w:t>UND</w:t>
+            </w:r>
+            <w:r>
+              <w:rPr>
+                <w:sz w:val="12"/>
+                <w:szCs w:val="12"/>
+              </w:rPr>
+              <w:t>. W/P</w:t>
+            </w:r>
+          </w:p>
+        </w:tc>
+        <w:tc>
+          <w:tcPr>
+            <w:tcW w:w="720" w:type="dxa"/>
+            <w:tcBorders>
+              <w:top w:val="single" w:sz="4" w:space="0" w:color="auto"/>
+              <w:left w:val="single" w:sz="4" w:space="0" w:color="auto"/>
+              <w:bottom w:val="single" w:sz="4" w:space="0" w:color="auto"/>
+              <w:right w:val="single" w:sz="4" w:space="0" w:color="auto"/>
+            </w:tcBorders>
+            <w:vAlign w:val="center"/>
+          </w:tcPr>
+          <w:p>
+            <w:pPr>
+              <w:tabs>
+                <w:tab w:val="left" w:pos="1084"/>
+              </w:tabs>
+              <w:spacing w:before="0"/>
+              <w:jc w:val="center"/>
+              <w:rPr>
+                <w:sz w:val="12"/>
+                <w:szCs w:val="12"/>
+              </w:rPr>
+            </w:pPr>
+            <w:r>
+              <w:rPr>
+                <w:sz w:val="12"/>
+                <w:szCs w:val="12"/>
+              </w:rPr>
+              <w:t>BAL</w:t>
+            </w:r>
+          </w:p>
+        </w:tc>
+        <w:tc>
+          <w:tcPr>
+            <w:tcW w:w="900" w:type="dxa"/>
+            <w:tcBorders>
+              <w:top w:val="single" w:sz="4" w:space="0" w:color="auto"/>
+              <w:left w:val="single" w:sz="4" w:space="0" w:color="auto"/>
+              <w:bottom w:val="single" w:sz="4" w:space="0" w:color="auto"/>
+              <w:right w:val="single" w:sz="4" w:space="0" w:color="auto"/>
+            </w:tcBorders>
+            <w:vAlign w:val="center"/>
+          </w:tcPr>
+          <w:p>
+            <w:pPr>
+              <w:tabs>
+                <w:tab w:val="left" w:pos="1084"/>
+              </w:tabs>
+              <w:spacing w:before="0"/>
+              <w:jc w:val="center"/>
+              <w:rPr>
+                <w:sz w:val="12"/>
+                <w:szCs w:val="12"/>
+              </w:rPr>
+            </w:pPr>
+            <w:r>
+              <w:rPr>
+                <w:sz w:val="12"/>
+                <w:szCs w:val="12"/>
+              </w:rPr>
+              <w:t>ABS</w:t>
+            </w:r>
+            <w:r>
+              <w:rPr>
+                <w:sz w:val="12"/>
+                <w:szCs w:val="12"/>
+              </w:rPr>
+              <w:t xml:space="preserve"> </w:t>
+            </w:r>
+            <w:r>
+              <w:rPr>
+                <w:sz w:val="12"/>
+                <w:szCs w:val="12"/>
+              </w:rPr>
+              <w:t>UND</w:t>
+            </w:r>
+            <w:r>
+              <w:rPr>
+                <w:sz w:val="12"/>
+                <w:szCs w:val="12"/>
+              </w:rPr>
+              <w:t>. W</w:t>
+            </w:r>
+            <w:r>
+              <w:rPr>
+                <w:sz w:val="12"/>
+                <w:szCs w:val="12"/>
+              </w:rPr>
+              <w:t>/O/</w:t>
+            </w:r>
+            <w:r>
+              <w:rPr>
+                <w:sz w:val="12"/>
+                <w:szCs w:val="12"/>
+              </w:rPr>
+              <w:t>P</w:t>
+            </w:r>
+          </w:p>
+        </w:tc>
+        <w:tc>
+          <w:tcPr>
+            <w:tcW w:w="720" w:type="dxa"/>
+            <w:tcBorders>
+              <w:top w:val="single" w:sz="4" w:space="0" w:color="auto"/>
+              <w:left w:val="single" w:sz="4" w:space="0" w:color="auto"/>
+              <w:bottom w:val="single" w:sz="4" w:space="0" w:color="auto"/>
+              <w:right w:val="single" w:sz="4" w:space="0" w:color="auto"/>
+            </w:tcBorders>
+            <w:vAlign w:val="center"/>
+          </w:tcPr>
+          <w:p>
+            <w:pPr>
+              <w:tabs>
+                <w:tab w:val="left" w:pos="1084"/>
+              </w:tabs>
+              <w:spacing w:before="0"/>
+              <w:jc w:val="center"/>
+              <w:rPr>
+                <w:sz w:val="12"/>
+                <w:szCs w:val="12"/>
+              </w:rPr>
+            </w:pPr>
+            <w:r>
+              <w:rPr>
+                <w:sz w:val="12"/>
+                <w:szCs w:val="12"/>
+              </w:rPr>
+              <w:t>EARNED</w:t>
+            </w:r>
+          </w:p>
+        </w:tc>
+        <w:tc>
+          <w:tcPr>
+            <w:tcW w:w="810" w:type="dxa"/>
+            <w:tcBorders>
+              <w:top w:val="single" w:sz="4" w:space="0" w:color="auto"/>
+              <w:left w:val="single" w:sz="4" w:space="0" w:color="auto"/>
+              <w:bottom w:val="single" w:sz="4" w:space="0" w:color="auto"/>
+              <w:right w:val="single" w:sz="4" w:space="0" w:color="auto"/>
+            </w:tcBorders>
+            <w:vAlign w:val="center"/>
+          </w:tcPr>
+          <w:p>
+            <w:pPr>
+              <w:tabs>
+                <w:tab w:val="left" w:pos="1084"/>
+              </w:tabs>
+              <w:spacing w:before="0"/>
+              <w:jc w:val="center"/>
+              <w:rPr>
+                <w:sz w:val="12"/>
+                <w:szCs w:val="12"/>
+              </w:rPr>
+            </w:pPr>
+            <w:r>
+              <w:rPr>
+                <w:sz w:val="12"/>
+                <w:szCs w:val="12"/>
+              </w:rPr>
+              <w:t>ABS</w:t>
+            </w:r>
+            <w:r>
+              <w:rPr>
+                <w:sz w:val="12"/>
+                <w:szCs w:val="12"/>
+              </w:rPr>
+              <w:t xml:space="preserve"> </w:t>
+            </w:r>
+            <w:r>
+              <w:rPr>
+                <w:sz w:val="12"/>
+                <w:szCs w:val="12"/>
+              </w:rPr>
+              <w:t>UND</w:t>
+            </w:r>
+            <w:r>
+              <w:rPr>
+                <w:sz w:val="12"/>
+                <w:szCs w:val="12"/>
+              </w:rPr>
+              <w:t>. W/P</w:t>
+            </w:r>
+          </w:p>
+        </w:tc>
+        <w:tc>
+          <w:tcPr>
+            <w:tcW w:w="720" w:type="dxa"/>
+            <w:tcBorders>
+              <w:top w:val="single" w:sz="4" w:space="0" w:color="auto"/>
+              <w:left w:val="single" w:sz="4" w:space="0" w:color="auto"/>
+              <w:bottom w:val="single" w:sz="4" w:space="0" w:color="auto"/>
+              <w:right w:val="single" w:sz="4" w:space="0" w:color="auto"/>
+            </w:tcBorders>
+            <w:vAlign w:val="center"/>
+          </w:tcPr>
+          <w:p>
+            <w:pPr>
+              <w:tabs>
+                <w:tab w:val="left" w:pos="1084"/>
+              </w:tabs>
+              <w:spacing w:before="0"/>
+              <w:jc w:val="center"/>
+              <w:rPr>
+                <w:sz w:val="12"/>
+                <w:szCs w:val="12"/>
+              </w:rPr>
+            </w:pPr>
+            <w:r>
+              <w:rPr>
+                <w:sz w:val="12"/>
+                <w:szCs w:val="12"/>
+              </w:rPr>
+              <w:t>BALANCE</w:t>
+            </w:r>
+          </w:p>
+        </w:tc>
+        <w:tc>
+          <w:tcPr>
+            <w:tcW w:w="900" w:type="dxa"/>
+            <w:tcBorders>
+              <w:top w:val="single" w:sz="4" w:space="0" w:color="auto"/>
+              <w:left w:val="single" w:sz="4" w:space="0" w:color="auto"/>
+              <w:bottom w:val="single" w:sz="4" w:space="0" w:color="auto"/>
+              <w:right w:val="single" w:sz="4" w:space="0" w:color="auto"/>
+            </w:tcBorders>
+            <w:vAlign w:val="center"/>
+          </w:tcPr>
+          <w:p>
+            <w:pPr>
+              <w:tabs>
+                <w:tab w:val="left" w:pos="1084"/>
+              </w:tabs>
+              <w:spacing w:before="0"/>
+              <w:jc w:val="center"/>
+              <w:rPr>
+                <w:sz w:val="12"/>
+                <w:szCs w:val="12"/>
+              </w:rPr>
+            </w:pPr>
+            <w:r>
+              <w:rPr>
+                <w:sz w:val="12"/>
+                <w:szCs w:val="12"/>
+              </w:rPr>
+              <w:t>ABS</w:t>
+            </w:r>
+            <w:r>
+              <w:rPr>
+                <w:sz w:val="12"/>
+                <w:szCs w:val="12"/>
+              </w:rPr>
+              <w:t xml:space="preserve"> </w:t>
+            </w:r>
+            <w:r>
+              <w:rPr>
+                <w:sz w:val="12"/>
+                <w:szCs w:val="12"/>
+              </w:rPr>
+              <w:t>UND</w:t>
+            </w:r>
+            <w:r>
+              <w:rPr>
+                <w:sz w:val="12"/>
+                <w:szCs w:val="12"/>
+              </w:rPr>
+              <w:t>. W/O/P</w:t>
+            </w:r>
+          </w:p>
+        </w:tc>
+        <w:tc>
+          <w:tcPr>
+            <w:tcW w:w="1800" w:type="dxa"/>
+            <w:vMerge/>
+            <w:tcBorders>
+              <w:top w:val="single" w:sz="4" w:space="0" w:color="auto"/>
+              <w:left w:val="single" w:sz="4" w:space="0" w:color="auto"/>
+              <w:bottom w:val="single" w:sz="4" w:space="0" w:color="auto"/>
+              <w:right w:val="single" w:sz="4" w:space="0" w:color="auto"/>
+            </w:tcBorders>
+          </w:tcPr>
+          <w:p>
+            <w:pPr>
+              <w:tabs>
+                <w:tab w:val="left" w:pos="1084"/>
+              </w:tabs>
+              <w:spacing w:before="0"/>
+            </w:pPr>
+          </w:p>
+        </w:tc>
+      </w:tr>
+      <w:tr>
+        <w:trPr>
           <w:trHeight w:val="317"/>
         </w:trPr>
         <w:tc>
           <w:tcPr>
-            <w:tcW w:w="1080" w:type="dxa"/>
-            <w:tcBorders>
-              <w:top w:val="nil"/>
-              <w:left w:val="nil"/>
-              <w:bottom w:val="nil"/>
-              <w:right w:val="nil"/>
+            <w:tcW w:w="1440" w:type="dxa"/>
+            <w:tcBorders>
+              <w:top w:val="single" w:sz="4" w:space="0" w:color="auto"/>
+              <w:left w:val="single" w:sz="4" w:space="0" w:color="auto"/>
+              <w:bottom w:val="single" w:sz="4" w:space="0" w:color="auto"/>
+              <w:right w:val="single" w:sz="4" w:space="0" w:color="auto"/>
             </w:tcBorders>
           </w:tcPr>
           <w:p>
@@ -785,12 +1334,12 @@
         </w:tc>
         <w:tc>
           <w:tcPr>
-            <w:tcW w:w="1800" w:type="dxa"/>
-            <w:tcBorders>
-              <w:top w:val="nil"/>
-              <w:left w:val="nil"/>
-              <w:bottom w:val="nil"/>
-              <w:right w:val="nil"/>
+            <w:tcW w:w="1440" w:type="dxa"/>
+            <w:tcBorders>
+              <w:top w:val="single" w:sz="4" w:space="0" w:color="auto"/>
+              <w:left w:val="single" w:sz="4" w:space="0" w:color="auto"/>
+              <w:bottom w:val="single" w:sz="4" w:space="0" w:color="auto"/>
+              <w:right w:val="single" w:sz="4" w:space="0" w:color="auto"/>
             </w:tcBorders>
           </w:tcPr>
           <w:p>
@@ -823,10 +1372,10 @@
           <w:tcPr>
             <w:tcW w:w="810" w:type="dxa"/>
             <w:tcBorders>
-              <w:top w:val="nil"/>
-              <w:left w:val="nil"/>
-              <w:bottom w:val="nil"/>
-              <w:right w:val="nil"/>
+              <w:top w:val="single" w:sz="4" w:space="0" w:color="auto"/>
+              <w:left w:val="single" w:sz="4" w:space="0" w:color="auto"/>
+              <w:bottom w:val="single" w:sz="4" w:space="0" w:color="auto"/>
+              <w:right w:val="single" w:sz="4" w:space="0" w:color="auto"/>
             </w:tcBorders>
           </w:tcPr>
           <w:p>
@@ -857,12 +1406,12 @@
         </w:tc>
         <w:tc>
           <w:tcPr>
-            <w:tcW w:w="810" w:type="dxa"/>
-            <w:tcBorders>
-              <w:top w:val="nil"/>
-              <w:left w:val="nil"/>
-              <w:bottom w:val="nil"/>
-              <w:right w:val="nil"/>
+            <w:tcW w:w="900" w:type="dxa"/>
+            <w:tcBorders>
+              <w:top w:val="single" w:sz="4" w:space="0" w:color="auto"/>
+              <w:left w:val="single" w:sz="4" w:space="0" w:color="auto"/>
+              <w:bottom w:val="single" w:sz="4" w:space="0" w:color="auto"/>
+              <w:right w:val="single" w:sz="4" w:space="0" w:color="auto"/>
             </w:tcBorders>
           </w:tcPr>
           <w:p>
@@ -893,12 +1442,12 @@
         </w:tc>
         <w:tc>
           <w:tcPr>
-            <w:tcW w:w="810" w:type="dxa"/>
-            <w:tcBorders>
-              <w:top w:val="nil"/>
-              <w:left w:val="nil"/>
-              <w:bottom w:val="nil"/>
-              <w:right w:val="nil"/>
+            <w:tcW w:w="720" w:type="dxa"/>
+            <w:tcBorders>
+              <w:top w:val="single" w:sz="4" w:space="0" w:color="auto"/>
+              <w:left w:val="single" w:sz="4" w:space="0" w:color="auto"/>
+              <w:bottom w:val="single" w:sz="4" w:space="0" w:color="auto"/>
+              <w:right w:val="single" w:sz="4" w:space="0" w:color="auto"/>
             </w:tcBorders>
           </w:tcPr>
           <w:p>
@@ -929,12 +1478,12 @@
         </w:tc>
         <w:tc>
           <w:tcPr>
-            <w:tcW w:w="810" w:type="dxa"/>
-            <w:tcBorders>
-              <w:top w:val="nil"/>
-              <w:left w:val="nil"/>
-              <w:bottom w:val="nil"/>
-              <w:right w:val="nil"/>
+            <w:tcW w:w="900" w:type="dxa"/>
+            <w:tcBorders>
+              <w:top w:val="single" w:sz="4" w:space="0" w:color="auto"/>
+              <w:left w:val="single" w:sz="4" w:space="0" w:color="auto"/>
+              <w:bottom w:val="single" w:sz="4" w:space="0" w:color="auto"/>
+              <w:right w:val="single" w:sz="4" w:space="0" w:color="auto"/>
             </w:tcBorders>
           </w:tcPr>
           <w:p>
@@ -965,12 +1514,12 @@
         </w:tc>
         <w:tc>
           <w:tcPr>
-            <w:tcW w:w="810" w:type="dxa"/>
-            <w:tcBorders>
-              <w:top w:val="nil"/>
-              <w:left w:val="nil"/>
-              <w:bottom w:val="nil"/>
-              <w:right w:val="nil"/>
+            <w:tcW w:w="720" w:type="dxa"/>
+            <w:tcBorders>
+              <w:top w:val="single" w:sz="4" w:space="0" w:color="auto"/>
+              <w:left w:val="single" w:sz="4" w:space="0" w:color="auto"/>
+              <w:bottom w:val="single" w:sz="4" w:space="0" w:color="auto"/>
+              <w:right w:val="single" w:sz="4" w:space="0" w:color="auto"/>
             </w:tcBorders>
           </w:tcPr>
           <w:p>
@@ -1003,10 +1552,10 @@
           <w:tcPr>
             <w:tcW w:w="810" w:type="dxa"/>
             <w:tcBorders>
-              <w:top w:val="nil"/>
-              <w:left w:val="nil"/>
-              <w:bottom w:val="nil"/>
-              <w:right w:val="nil"/>
+              <w:top w:val="single" w:sz="4" w:space="0" w:color="auto"/>
+              <w:left w:val="single" w:sz="4" w:space="0" w:color="auto"/>
+              <w:bottom w:val="single" w:sz="4" w:space="0" w:color="auto"/>
+              <w:right w:val="single" w:sz="4" w:space="0" w:color="auto"/>
             </w:tcBorders>
           </w:tcPr>
           <w:p>
@@ -1037,12 +1586,12 @@
         </w:tc>
         <w:tc>
           <w:tcPr>
-            <w:tcW w:w="810" w:type="dxa"/>
-            <w:tcBorders>
-              <w:top w:val="nil"/>
-              <w:left w:val="nil"/>
-              <w:bottom w:val="nil"/>
-              <w:right w:val="nil"/>
+            <w:tcW w:w="720" w:type="dxa"/>
+            <w:tcBorders>
+              <w:top w:val="single" w:sz="4" w:space="0" w:color="auto"/>
+              <w:left w:val="single" w:sz="4" w:space="0" w:color="auto"/>
+              <w:bottom w:val="single" w:sz="4" w:space="0" w:color="auto"/>
+              <w:right w:val="single" w:sz="4" w:space="0" w:color="auto"/>
             </w:tcBorders>
           </w:tcPr>
           <w:p>
@@ -1073,12 +1622,12 @@
         </w:tc>
         <w:tc>
           <w:tcPr>
-            <w:tcW w:w="720" w:type="dxa"/>
-            <w:tcBorders>
-              <w:top w:val="nil"/>
-              <w:left w:val="nil"/>
-              <w:bottom w:val="nil"/>
-              <w:right w:val="nil"/>
+            <w:tcW w:w="900" w:type="dxa"/>
+            <w:tcBorders>
+              <w:top w:val="single" w:sz="4" w:space="0" w:color="auto"/>
+              <w:left w:val="single" w:sz="4" w:space="0" w:color="auto"/>
+              <w:bottom w:val="single" w:sz="4" w:space="0" w:color="auto"/>
+              <w:right w:val="single" w:sz="4" w:space="0" w:color="auto"/>
             </w:tcBorders>
           </w:tcPr>
           <w:p>
@@ -1108,12 +1657,12 @@
         </w:tc>
         <w:tc>
           <w:tcPr>
-            <w:tcW w:w="1365" w:type="dxa"/>
-            <w:tcBorders>
-              <w:top w:val="nil"/>
-              <w:left w:val="nil"/>
-              <w:bottom w:val="nil"/>
-              <w:right w:val="nil"/>
+            <w:tcW w:w="1800" w:type="dxa"/>
+            <w:tcBorders>
+              <w:top w:val="single" w:sz="4" w:space="0" w:color="auto"/>
+              <w:left w:val="single" w:sz="4" w:space="0" w:color="auto"/>
+              <w:bottom w:val="single" w:sz="4" w:space="0" w:color="auto"/>
+              <w:right w:val="single" w:sz="4" w:space="0" w:color="auto"/>
             </w:tcBorders>
           </w:tcPr>
           <w:p>
@@ -1146,22 +1695,6 @@
     </w:tbl>
     <w:p/>
     <w:p/>
-    <w:p>
-      <w:pPr>
-        <w:framePr w:w="657" w:wrap="auto" w:vAnchor="page" w:hAnchor="page" w:x="9453" w:y="5048"/>
-        <w:widowControl w:val="0"/>
-        <w:autoSpaceDE w:val="0"/>
-        <w:autoSpaceDN w:val="0"/>
-        <w:adjustRightInd w:val="0"/>
-        <w:spacing w:before="0" w:after="0" w:line="211" w:lineRule="exact"/>
-        <w:jc w:val="left"/>
-        <w:rPr>
-          <w:rFonts w:cs="Calibri"/>
-          <w:color w:val="000000"/>
-          <w:sz w:val="20"/>
-        </w:rPr>
-      </w:pPr>
-    </w:p>
     <w:p>
       <w:pPr>
         <w:tabs>

</xml_diff>